<commit_message>
docs: Dokumentation aktualisiert (Changelog, Funktionsreferenz, StateMachines, Bedienungsanleitung)
Bedienungsanleitung einheitlich auf bTn_Wecker_*-Namensschema umbenannt.

Co-Authored-By: Claude Opus 4.6 <noreply@anthropic.com>
</commit_message>
<xml_diff>
--- a/Dokumentation/Diagramme/bTn_Wecker_StateMachines.docx
+++ b/Dokumentation/Diagramme/bTn_Wecker_StateMachines.docx
@@ -48,7 +48,7 @@
           <w:sz w:val="18"/>
           <w:szCs w:val="18"/>
         </w:rPr>
-        <w:t xml:space="preserve">Firmware 8v2  ·  ESP32 / FreeRTOS</w:t>
+        <w:t xml:space="preserve">Firmware 9v14  ·  ESP32 / FreeRTOS</w:t>
       </w:r>
     </w:p>
     <w:p>
@@ -108,7 +108,7 @@
       <w:r>
         <w:drawing>
           <wp:inline distT="0" distB="0" distL="0" distR="0">
-            <wp:extent cx="4857750" cy="1781175"/>
+            <wp:extent cx="4857750" cy="1866900"/>
             <wp:effectExtent t="0" r="0" b="0" l="0"/>
             <wp:docPr id="1" name="" descr="" title=""/>
             <wp:cNvGraphicFramePr>
@@ -133,7 +133,7 @@
                   <pic:spPr bwMode="auto">
                     <a:xfrm>
                       <a:off x="0" y="0"/>
-                      <a:ext cx="4857750" cy="1781175"/>
+                      <a:ext cx="4857750" cy="1866900"/>
                     </a:xfrm>
                     <a:prstGeom prst="rect">
                       <a:avLst/>
@@ -166,38 +166,61 @@
           <w:sz w:val="18"/>
           <w:szCs w:val="18"/>
         </w:rPr>
-        <w:t xml:space="preserve">Bedingungen für IDLE → RUNNING:  </w:t>
-      </w:r>
-      <w:r>
-        <w:rPr>
-          <w:rFonts w:ascii="Arial" w:cs="Arial" w:eastAsia="Arial" w:hAnsi="Arial"/>
-          <w:sz w:val="18"/>
-          <w:szCs w:val="18"/>
-        </w:rPr>
-        <w:t xml:space="preserve">aX_on=true, sec==0, min==aX_min, hour==aX_hour, min≠lastAXMin (Minuten-Sperre). Alarm 1 hat Vorrang vor Alarm 2 bei gleicher Zeit (else if). playerMutex schützt playFolder()-Aufruf.</w:t>
-      </w:r>
-    </w:p>
-    <w:p>
-      <w:pPr>
-        <w:spacing w:before="0" w:after="60"/>
-      </w:pPr>
-      <w:r>
-        <w:rPr>
-          <w:rFonts w:ascii="Arial" w:cs="Arial" w:eastAsia="Arial" w:hAnsi="Arial"/>
-          <w:b/>
-          <w:bCs/>
-          <w:sz w:val="18"/>
-          <w:szCs w:val="18"/>
-        </w:rPr>
-        <w:t xml:space="preserve">Bedingungen für RUNNING → IDLE:  </w:t>
-      </w:r>
-      <w:r>
-        <w:rPr>
-          <w:rFonts w:ascii="Arial" w:cs="Arial" w:eastAsia="Arial" w:hAnsi="Arial"/>
-          <w:sz w:val="18"/>
-          <w:szCs w:val="18"/>
-        </w:rPr>
-        <w:t xml:space="preserve">Nach ALARM_POLL_MS (5 s): playerStatus &lt; 1 (MP3 beendet). Ausgänge E2/E3 aus. Minuten-Sperren zurückgesetzt. Manueller Abbruch via S1 ebenfalls möglich.</w:t>
+        <w:t xml:space="preserve">IDLE → RUNNING (9v14):  </w:t>
+      </w:r>
+      <w:r>
+        <w:rPr>
+          <w:rFonts w:ascii="Arial" w:cs="Arial" w:eastAsia="Arial" w:hAnsi="Arial"/>
+          <w:sz w:val="18"/>
+          <w:szCs w:val="18"/>
+        </w:rPr>
+        <w:t xml:space="preserve">Alarmzeit erreicht, aX_on=true, min≠lastAXMin, UND playFolder() unter playerMutex erfolgreich. Kein Zustandswechsel bei Mutex-Timeout → nächster 500ms-Tick versucht es erneut (kein stiller Alarm).</w:t>
+      </w:r>
+    </w:p>
+    <w:p>
+      <w:pPr>
+        <w:spacing w:before="0" w:after="60"/>
+      </w:pPr>
+      <w:r>
+        <w:rPr>
+          <w:rFonts w:ascii="Arial" w:cs="Arial" w:eastAsia="Arial" w:hAnsi="Arial"/>
+          <w:b/>
+          <w:bCs/>
+          <w:sz w:val="18"/>
+          <w:szCs w:val="18"/>
+        </w:rPr>
+        <w:t xml:space="preserve">RUNNING → IDLE:  </w:t>
+      </w:r>
+      <w:r>
+        <w:rPr>
+          <w:rFonts w:ascii="Arial" w:cs="Arial" w:eastAsia="Arial" w:hAnsi="Arial"/>
+          <w:sz w:val="18"/>
+          <w:szCs w:val="18"/>
+        </w:rPr>
+        <w:t xml:space="preserve">playerStatus==0 (9v4: war &lt;1) nach ALARM_POLL_MS (5s). readState()==-1 bei UART-Timeout wird nicht mehr als 'MP3 beendet' interpretiert.</w:t>
+      </w:r>
+    </w:p>
+    <w:p>
+      <w:pPr>
+        <w:spacing w:before="0" w:after="60"/>
+      </w:pPr>
+      <w:r>
+        <w:rPr>
+          <w:rFonts w:ascii="Arial" w:cs="Arial" w:eastAsia="Arial" w:hAnsi="Arial"/>
+          <w:b/>
+          <w:bCs/>
+          <w:sz w:val="18"/>
+          <w:szCs w:val="18"/>
+        </w:rPr>
+        <w:t xml:space="preserve">S1 (manueller Abbruch):  </w:t>
+      </w:r>
+      <w:r>
+        <w:rPr>
+          <w:rFonts w:ascii="Arial" w:cs="Arial" w:eastAsia="Arial" w:hAnsi="Arial"/>
+          <w:sz w:val="18"/>
+          <w:szCs w:val="18"/>
+        </w:rPr>
+        <w:t xml:space="preserve">stoppt DFPlayer, setzt Ausgänge E2/E3 LOW, alarmState=ALARM_IDLE, Sperren auf 0xFF.</w:t>
       </w:r>
     </w:p>
     <w:p>
@@ -254,7 +277,7 @@
       <w:r>
         <w:drawing>
           <wp:inline distT="0" distB="0" distL="0" distR="0">
-            <wp:extent cx="4857750" cy="1781175"/>
+            <wp:extent cx="4857750" cy="1866900"/>
             <wp:effectExtent t="0" r="0" b="0" l="0"/>
             <wp:docPr id="1" name="" descr="" title=""/>
             <wp:cNvGraphicFramePr>
@@ -279,7 +302,7 @@
                   <pic:spPr bwMode="auto">
                     <a:xfrm>
                       <a:off x="0" y="0"/>
-                      <a:ext cx="4857750" cy="1781175"/>
+                      <a:ext cx="4857750" cy="1866900"/>
                     </a:xfrm>
                     <a:prstGeom prst="rect">
                       <a:avLst/>
@@ -312,38 +335,61 @@
           <w:sz w:val="18"/>
           <w:szCs w:val="18"/>
         </w:rPr>
-        <w:t xml:space="preserve">Bedingungen für IDLE → RUNNING:  </w:t>
-      </w:r>
-      <w:r>
-        <w:rPr>
-          <w:rFonts w:ascii="Arial" w:cs="Arial" w:eastAsia="Arial" w:hAnsi="Arial"/>
-          <w:sz w:val="18"/>
-          <w:szCs w:val="18"/>
-        </w:rPr>
-        <w:t xml:space="preserve">min==0, sec==0, cuckoo_on=true, min≠lastCuckooMin, !alarmThisHour, inTimeWindow. Zeitfenster: cuckoo_onTime ≤ hour ≤ cuckoo_offTime (Mitternacht-Überlauf möglich). E1 HIGH.</w:t>
-      </w:r>
-    </w:p>
-    <w:p>
-      <w:pPr>
-        <w:spacing w:before="0" w:after="60"/>
-      </w:pPr>
-      <w:r>
-        <w:rPr>
-          <w:rFonts w:ascii="Arial" w:cs="Arial" w:eastAsia="Arial" w:hAnsi="Arial"/>
-          <w:b/>
-          <w:bCs/>
-          <w:sz w:val="18"/>
-          <w:szCs w:val="18"/>
-        </w:rPr>
-        <w:t xml:space="preserve">Bedingungen für RUNNING → IDLE:  </w:t>
-      </w:r>
-      <w:r>
-        <w:rPr>
-          <w:rFonts w:ascii="Arial" w:cs="Arial" w:eastAsia="Arial" w:hAnsi="Arial"/>
-          <w:sz w:val="18"/>
-          <w:szCs w:val="18"/>
-        </w:rPr>
-        <w:t xml:space="preserve">CUCKOO_DURATION_MS (7,5 s) abgelaufen. E1 LOW. lastCuckooMin = 0xFF (Sperre aufheben).</w:t>
+        <w:t xml:space="preserve">IDLE → RUNNING:  </w:t>
+      </w:r>
+      <w:r>
+        <w:rPr>
+          <w:rFonts w:ascii="Arial" w:cs="Arial" w:eastAsia="Arial" w:hAnsi="Arial"/>
+          <w:sz w:val="18"/>
+          <w:szCs w:val="18"/>
+        </w:rPr>
+        <w:t xml:space="preserve">min==0, sec==0, cuckoo_on=true, min≠lastCuckooMin, !alarmThisHour, inTimeWindow. E1 HIGH.</w:t>
+      </w:r>
+    </w:p>
+    <w:p>
+      <w:pPr>
+        <w:spacing w:before="0" w:after="60"/>
+      </w:pPr>
+      <w:r>
+        <w:rPr>
+          <w:rFonts w:ascii="Arial" w:cs="Arial" w:eastAsia="Arial" w:hAnsi="Arial"/>
+          <w:b/>
+          <w:bCs/>
+          <w:sz w:val="18"/>
+          <w:szCs w:val="18"/>
+        </w:rPr>
+        <w:t xml:space="preserve">RUNNING → IDLE:  </w:t>
+      </w:r>
+      <w:r>
+        <w:rPr>
+          <w:rFonts w:ascii="Arial" w:cs="Arial" w:eastAsia="Arial" w:hAnsi="Arial"/>
+          <w:sz w:val="18"/>
+          <w:szCs w:val="18"/>
+        </w:rPr>
+        <w:t xml:space="preserve">CUCKOO_DURATION_MS (7,5s) abgelaufen. E1 LOW. lastCuckooMin=0xFF.</w:t>
+      </w:r>
+    </w:p>
+    <w:p>
+      <w:pPr>
+        <w:spacing w:before="0" w:after="60"/>
+      </w:pPr>
+      <w:r>
+        <w:rPr>
+          <w:rFonts w:ascii="Arial" w:cs="Arial" w:eastAsia="Arial" w:hAnsi="Arial"/>
+          <w:b/>
+          <w:bCs/>
+          <w:sz w:val="18"/>
+          <w:szCs w:val="18"/>
+        </w:rPr>
+        <w:t xml:space="preserve">Zeitfenster:  </w:t>
+      </w:r>
+      <w:r>
+        <w:rPr>
+          <w:rFonts w:ascii="Arial" w:cs="Arial" w:eastAsia="Arial" w:hAnsi="Arial"/>
+          <w:sz w:val="18"/>
+          <w:szCs w:val="18"/>
+        </w:rPr>
+        <w:t xml:space="preserve">cuckoo_onTime ≤ hour ≤ cuckoo_offTime (normal). Mitternacht-Überlauf: hour ≥ onTime ODER hour ≤ offTime.</w:t>
       </w:r>
     </w:p>
     <w:p>
@@ -381,7 +427,7 @@
           <w:sz w:val="18"/>
           <w:szCs w:val="18"/>
         </w:rPr>
-        <w:t xml:space="preserve">Task: touchTask (Core 0, Pri 2)  ·  Takt: TOUCH_POLL_MS  ·  Zustände: TS_IDLE, TS_PRESSED, TS_REPEAT</w:t>
+        <w:t xml:space="preserve">Task: touchTask (Core 0, Pri 2)  ·  Takt: TOUCH_POLL_MS (50 ms)  ·  Zustände: TS_IDLE, TS_PRESSED, TS_REPEAT</w:t>
       </w:r>
     </w:p>
     <w:p>
@@ -400,7 +446,7 @@
       <w:r>
         <w:drawing>
           <wp:inline distT="0" distB="0" distL="0" distR="0">
-            <wp:extent cx="5667375" cy="2105025"/>
+            <wp:extent cx="5667375" cy="2143125"/>
             <wp:effectExtent t="0" r="0" b="0" l="0"/>
             <wp:docPr id="1" name="" descr="" title=""/>
             <wp:cNvGraphicFramePr>
@@ -425,7 +471,7 @@
                   <pic:spPr bwMode="auto">
                     <a:xfrm>
                       <a:off x="0" y="0"/>
-                      <a:ext cx="5667375" cy="2105025"/>
+                      <a:ext cx="5667375" cy="2143125"/>
                     </a:xfrm>
                     <a:prstGeom prst="rect">
                       <a:avLst/>
@@ -466,7 +512,7 @@
           <w:sz w:val="18"/>
           <w:szCs w:val="18"/>
         </w:rPr>
-        <w:t xml:space="preserve">Pad-Rohwert &lt; Schwellwert (Baseline − TOUCH_DROP). Sofort EVT_TX in inputQueue. Nur ein Pad gleichzeitig aktiv (Exklusivität).</w:t>
+        <w:t xml:space="preserve">padWert &lt; (baseline − TOUCH_DROP=150). Sofort EVT_TX in inputQueue. Exklusivität: nur ein Pad aktiv.</w:t>
       </w:r>
     </w:p>
     <w:p>
@@ -489,30 +535,30 @@
           <w:sz w:val="18"/>
           <w:szCs w:val="18"/>
         </w:rPr>
-        <w:t xml:space="preserve">Pad noch gedrückt nach TOUCH_HOLD_MS (750 ms). Weiterer EVT, wechselt zu REPEAT.</w:t>
-      </w:r>
-    </w:p>
-    <w:p>
-      <w:pPr>
-        <w:spacing w:before="0" w:after="60"/>
-      </w:pPr>
-      <w:r>
-        <w:rPr>
-          <w:rFonts w:ascii="Arial" w:cs="Arial" w:eastAsia="Arial" w:hAnsi="Arial"/>
-          <w:b/>
-          <w:bCs/>
-          <w:sz w:val="18"/>
-          <w:szCs w:val="18"/>
-        </w:rPr>
-        <w:t xml:space="preserve">TS_REPEAT:  </w:t>
-      </w:r>
-      <w:r>
-        <w:rPr>
-          <w:rFonts w:ascii="Arial" w:cs="Arial" w:eastAsia="Arial" w:hAnsi="Arial"/>
-          <w:sz w:val="18"/>
-          <w:szCs w:val="18"/>
-        </w:rPr>
-        <w:t xml:space="preserve">Alle TOUCH_REPEAT_MS (250 ms) ein weiterer EVT, solange Pad gedrückt. Touch OFF → TS_IDLE. ISR-Debouncing (30 ms) filtert Hardware-Prellen vor Queueeintrag.</w:t>
+        <w:t xml:space="preserve">Pad noch gedrückt nach TOUCH_HOLD_MS (750ms). Weiterer EVT, Repeat alle TOUCH_REPEAT_MS (250ms).</w:t>
+      </w:r>
+    </w:p>
+    <w:p>
+      <w:pPr>
+        <w:spacing w:before="0" w:after="60"/>
+      </w:pPr>
+      <w:r>
+        <w:rPr>
+          <w:rFonts w:ascii="Arial" w:cs="Arial" w:eastAsia="Arial" w:hAnsi="Arial"/>
+          <w:b/>
+          <w:bCs/>
+          <w:sz w:val="18"/>
+          <w:szCs w:val="18"/>
+        </w:rPr>
+        <w:t xml:space="preserve">Baseline-Rekalibrierung:  </w:t>
+      </w:r>
+      <w:r>
+        <w:rPr>
+          <w:rFonts w:ascii="Arial" w:cs="Arial" w:eastAsia="Arial" w:hAnsi="Arial"/>
+          <w:sz w:val="18"/>
+          <w:szCs w:val="18"/>
+        </w:rPr>
+        <w:t xml:space="preserve">Alle TOUCH_RECAL_MS (10min) im TS_IDLE – aktualisiert Snapshot via updateSnapTouch().</w:t>
       </w:r>
     </w:p>
     <w:p>
@@ -569,7 +615,7 @@
       <w:r>
         <w:drawing>
           <wp:inline distT="0" distB="0" distL="0" distR="0">
-            <wp:extent cx="5905500" cy="2886075"/>
+            <wp:extent cx="5905500" cy="2952750"/>
             <wp:effectExtent t="0" r="0" b="0" l="0"/>
             <wp:docPr id="1" name="" descr="" title=""/>
             <wp:cNvGraphicFramePr>
@@ -594,7 +640,7 @@
                   <pic:spPr bwMode="auto">
                     <a:xfrm>
                       <a:off x="0" y="0"/>
-                      <a:ext cx="5905500" cy="2886075"/>
+                      <a:ext cx="5905500" cy="2952750"/>
                     </a:xfrm>
                     <a:prstGeom prst="rect">
                       <a:avLst/>
@@ -635,7 +681,7 @@
           <w:sz w:val="18"/>
           <w:szCs w:val="18"/>
         </w:rPr>
-        <w:t xml:space="preserve">Zyklisch: UI_CLOCK → ALARM1 → ALARM2 → SOUND1 → SOUND2 → FUNCS → CUCKOO_TIME → UI_CLOCK. Auf UI_INFO wird T0 an onInfo() delegiert (WiFi-Konfigurator).</w:t>
+        <w:t xml:space="preserve">UI_CLOCK → ALARM1 → ALARM2 → SOUND1 → SOUND2 → FUNCS → CUCKOO_TIME → UI_CLOCK.</w:t>
       </w:r>
     </w:p>
     <w:p>
@@ -658,30 +704,76 @@
           <w:sz w:val="18"/>
           <w:szCs w:val="18"/>
         </w:rPr>
-        <w:t xml:space="preserve">Von jeder Seite: → UI_INFO. Von UI_INFO: → UI_CLOCK. Entprellung via BTN_LOCKOUT_MS (1000 ms).</w:t>
-      </w:r>
-    </w:p>
-    <w:p>
-      <w:pPr>
-        <w:spacing w:before="0" w:after="60"/>
-      </w:pPr>
-      <w:r>
-        <w:rPr>
-          <w:rFonts w:ascii="Arial" w:cs="Arial" w:eastAsia="Arial" w:hAnsi="Arial"/>
-          <w:b/>
-          <w:bCs/>
-          <w:sz w:val="18"/>
-          <w:szCs w:val="18"/>
-        </w:rPr>
-        <w:t xml:space="preserve">Auto-Rückkehr:  </w:t>
-      </w:r>
-      <w:r>
-        <w:rPr>
-          <w:rFonts w:ascii="Arial" w:cs="Arial" w:eastAsia="Arial" w:hAnsi="Arial"/>
-          <w:sz w:val="18"/>
-          <w:szCs w:val="18"/>
-        </w:rPr>
-        <w:t xml:space="preserve">displayTask löst nach AUTO_RETURN_MS (20 s) ohne Touch-Event uiTransition(UI_CLOCK) aus. UI_INFO ist ausgenommen.</w:t>
+        <w:t xml:space="preserve">Von jeder Seite → UI_INFO. Von UI_INFO → UI_CLOCK. S3 aktualisiert lastTouchMs (9v7: korrektes Auto-Rückkehr-Timing).</w:t>
+      </w:r>
+    </w:p>
+    <w:p>
+      <w:pPr>
+        <w:spacing w:before="0" w:after="60"/>
+      </w:pPr>
+      <w:r>
+        <w:rPr>
+          <w:rFonts w:ascii="Arial" w:cs="Arial" w:eastAsia="Arial" w:hAnsi="Arial"/>
+          <w:b/>
+          <w:bCs/>
+          <w:sz w:val="18"/>
+          <w:szCs w:val="18"/>
+        </w:rPr>
+        <w:t xml:space="preserve">Auto-Rückkehr (9v6):  </w:t>
+      </w:r>
+      <w:r>
+        <w:rPr>
+          <w:rFonts w:ascii="Arial" w:cs="Arial" w:eastAsia="Arial" w:hAnsi="Arial"/>
+          <w:sz w:val="18"/>
+          <w:szCs w:val="18"/>
+        </w:rPr>
+        <w:t xml:space="preserve">Nach AUTO_RETURN_MS (20s) ohne Touch → UI_CLOCK. Ab 9v6 auch von UI_INFO (war zuvor ausgenommen).</w:t>
+      </w:r>
+    </w:p>
+    <w:p>
+      <w:pPr>
+        <w:spacing w:before="0" w:after="60"/>
+      </w:pPr>
+      <w:r>
+        <w:rPr>
+          <w:rFonts w:ascii="Arial" w:cs="Arial" w:eastAsia="Arial" w:hAnsi="Arial"/>
+          <w:b/>
+          <w:bCs/>
+          <w:sz w:val="18"/>
+          <w:szCs w:val="18"/>
+        </w:rPr>
+        <w:t xml:space="preserve">T0 auf UI_INFO:  </w:t>
+      </w:r>
+      <w:r>
+        <w:rPr>
+          <w:rFonts w:ascii="Arial" w:cs="Arial" w:eastAsia="Arial" w:hAnsi="Arial"/>
+          <w:sz w:val="18"/>
+          <w:szCs w:val="18"/>
+        </w:rPr>
+        <w:t xml:space="preserve">WiFi-Konfigurator starten.</w:t>
+      </w:r>
+    </w:p>
+    <w:p>
+      <w:pPr>
+        <w:spacing w:before="0" w:after="60"/>
+      </w:pPr>
+      <w:r>
+        <w:rPr>
+          <w:rFonts w:ascii="Arial" w:cs="Arial" w:eastAsia="Arial" w:hAnsi="Arial"/>
+          <w:b/>
+          <w:bCs/>
+          <w:sz w:val="18"/>
+          <w:szCs w:val="18"/>
+        </w:rPr>
+        <w:t xml:space="preserve">T4 auf UI_INFO:  </w:t>
+      </w:r>
+      <w:r>
+        <w:rPr>
+          <w:rFonts w:ascii="Arial" w:cs="Arial" w:eastAsia="Arial" w:hAnsi="Arial"/>
+          <w:sz w:val="18"/>
+          <w:szCs w:val="18"/>
+        </w:rPr>
+        <w:t xml:space="preserve">Werksreset (nvs_flash_erase + restart).</w:t>
       </w:r>
     </w:p>
     <w:p>
@@ -706,7 +798,7 @@
           <w:sz w:val="16"/>
           <w:szCs w:val="16"/>
         </w:rPr>
-        <w:t xml:space="preserve">bTn Wecker  ·  State-Machine-Diagramme  ·  Firmware 8v2</w:t>
+        <w:t xml:space="preserve">bTn Wecker  ·  State-Machine-Diagramme  ·  Firmware 9v14</w:t>
       </w:r>
     </w:p>
     <w:sectPr>
@@ -832,7 +924,7 @@
         <w:sz w:val="16"/>
         <w:szCs w:val="16"/>
       </w:rPr>
-      <w:t xml:space="preserve">bTn Wecker  –  State-Machine-Diagramme</w:t>
+      <w:t xml:space="preserve">bTn Wecker  –  State-Machine-Diagramme  ·  9v14</w:t>
     </w:r>
   </w:p>
 </w:hdr>

</xml_diff>